<commit_message>
Phase 4: CLV and revenue-at-risk modeling
</commit_message>
<xml_diff>
--- a/project/reports/Executive_Summary.docx
+++ b/project/reports/Executive_Summary.docx
@@ -196,7 +196,7 @@
                 <w:sz w:val="32"/>
                 <w:szCs w:val="32"/>
               </w:rPr>
-              <w:t xml:space="preserve">36.7%</w:t>
+              <w:t xml:space="preserve">$4.36M</w:t>
             </w:r>
           </w:p>
           <w:p>
@@ -210,7 +210,7 @@
                 <w:sz w:val="17"/>
                 <w:szCs w:val="17"/>
               </w:rPr>
-              <w:t xml:space="preserve">Highest-Risk Segment</w:t>
+              <w:t xml:space="preserve">Annual Revenue at Risk</w:t>
             </w:r>
           </w:p>
         </w:tc>
@@ -284,7 +284,7 @@
                 <w:sz w:val="32"/>
                 <w:szCs w:val="32"/>
               </w:rPr>
-              <w:t xml:space="preserve">$185.6M</w:t>
+              <w:t xml:space="preserve">$16.1M</w:t>
             </w:r>
           </w:p>
           <w:p>
@@ -298,7 +298,7 @@
                 <w:sz w:val="17"/>
                 <w:szCs w:val="17"/>
               </w:rPr>
-              <w:t xml:space="preserve">Balance Exposure</w:t>
+              <w:t xml:space="preserve">Premium CLV Exposure</w:t>
             </w:r>
           </w:p>
         </w:tc>
@@ -364,7 +364,7 @@
           <w:sz w:val="21"/>
           <w:szCs w:val="21"/>
         </w:rPr>
-        <w:t xml:space="preserve">Inactivity is the real risk — especially paired with high balance. 1,247 customers are both inactive and high-balance; they churn at 30.5% and represent $185.6M in exposure.</w:t>
+        <w:t xml:space="preserve">Inactivity is the real risk — especially paired with high balance. 1,247 customers are both inactive and high-balance; they churn at 30.5% and represent an estimated $16.1M in lifetime value exposure.</w:t>
       </w:r>
     </w:p>
     <w:p>
@@ -400,7 +400,25 @@
           <w:sz w:val="21"/>
           <w:szCs w:val="21"/>
         </w:rPr>
-        <w:t xml:space="preserve">A simple composite score — the Relationship Strength Index, built from activity and product depth — separates customers into risk tiers with a more than 3x churn spread (Weak 40.3% vs. Strong 12.4%).</w:t>
+        <w:t xml:space="preserve">A simple composite score — the Relationship Strength Index, built from activity and product depth — separates customers into risk tiers with a more than 3x churn spread (Weak 40.3% vs. Strong 12.4%), and a 2.7x lifetime-value spread ($6,453 vs. $17,111 per customer).</w:t>
+      </w:r>
+    </w:p>
+    <w:p>
+      <w:pPr>
+        <w:pStyle w:val="ListParagraph"/>
+        <w:numPr>
+          <w:ilvl w:val="0"/>
+          <w:numId w:val="2"/>
+        </w:numPr>
+        <w:spacing w:after="70" w:line="260"/>
+      </w:pPr>
+      <w:r>
+        <w:rPr>
+          <w:rFonts w:ascii="Calibri" w:cs="Calibri" w:eastAsia="Calibri" w:hAnsi="Calibri"/>
+          <w:sz w:val="21"/>
+          <w:szCs w:val="21"/>
+        </w:rPr>
+        <w:t xml:space="preserve">Illustrative ROI modeling shows both proposed campaigns below (Premium At-Risk outreach, Inactive Disengaged re-engagement) pay back 12–18x their cost even under conservative assumptions — full detail in the research paper, Section 10.</w:t>
       </w:r>
     </w:p>
     <w:p>
@@ -664,7 +682,7 @@
                 <w:sz w:val="20"/>
                 <w:szCs w:val="20"/>
               </w:rPr>
-              <w:t xml:space="preserve">Highest financial exposure: $185.6M in balances</w:t>
+              <w:t xml:space="preserve">Highest financial exposure: $16.1M in estimated lifetime value</w:t>
             </w:r>
           </w:p>
         </w:tc>

</xml_diff>